<commit_message>
changes for final submission
</commit_message>
<xml_diff>
--- a/documents/Final Document.docx
+++ b/documents/Final Document.docx
@@ -556,16 +556,14 @@
         </w:rPr>
         <w:t xml:space="preserve"> </w:t>
       </w:r>
-      <w:proofErr w:type="spellStart"/>
       <w:r>
         <w:rPr>
           <w:b/>
           <w:spacing w:val="-2"/>
           <w:sz w:val="28"/>
         </w:rPr>
-        <w:t>Msc</w:t>
-      </w:r>
-      <w:proofErr w:type="spellEnd"/>
+        <w:t>M.Sc.</w:t>
+      </w:r>
       <w:r>
         <w:rPr>
           <w:b/>
@@ -580,11 +578,15 @@
         <w:spacing w:before="45" w:line="276" w:lineRule="auto"/>
         <w:jc w:val="center"/>
         <w:rPr>
+          <w:b/>
+          <w:bCs/>
           <w:sz w:val="28"/>
         </w:rPr>
       </w:pPr>
       <w:r>
         <w:rPr>
+          <w:b/>
+          <w:bCs/>
           <w:noProof/>
           <w:sz w:val="20"/>
         </w:rPr>
@@ -634,22 +636,44 @@
       </w:r>
       <w:r>
         <w:rPr>
+          <w:b/>
+          <w:bCs/>
           <w:sz w:val="28"/>
         </w:rPr>
-        <w:t xml:space="preserve">Associate Professor </w:t>
-      </w:r>
-      <w:proofErr w:type="spellStart"/>
+        <w:t>Associate Professor</w:t>
+      </w:r>
+    </w:p>
+    <w:p>
+      <w:pPr>
+        <w:spacing w:before="45" w:line="276" w:lineRule="auto"/>
+        <w:jc w:val="center"/>
+        <w:rPr>
+          <w:sz w:val="28"/>
+        </w:rPr>
+      </w:pPr>
+      <w:r>
+        <w:rPr>
+          <w:sz w:val="28"/>
+        </w:rPr>
+        <w:t xml:space="preserve"> Department of Studies</w:t>
+      </w:r>
+      <w:r>
+        <w:rPr>
+          <w:spacing w:val="-16"/>
+          <w:sz w:val="28"/>
+        </w:rPr>
+        <w:t xml:space="preserve"> </w:t>
+      </w:r>
       <w:r>
         <w:rPr>
           <w:spacing w:val="-2"/>
           <w:sz w:val="28"/>
         </w:rPr>
-        <w:t>DoS&amp;R</w:t>
-      </w:r>
-      <w:proofErr w:type="spellEnd"/>
-      <w:r>
-        <w:rPr>
-          <w:spacing w:val="-16"/>
+        <w:t>in</w:t>
+      </w:r>
+      <w:r>
+        <w:rPr>
+          <w:spacing w:val="-6"/>
           <w:sz w:val="28"/>
         </w:rPr>
         <w:t xml:space="preserve"> </w:t>
@@ -659,11 +683,11 @@
           <w:spacing w:val="-2"/>
           <w:sz w:val="28"/>
         </w:rPr>
-        <w:t>in</w:t>
-      </w:r>
-      <w:r>
-        <w:rPr>
-          <w:spacing w:val="-6"/>
+        <w:t>Computer</w:t>
+      </w:r>
+      <w:r>
+        <w:rPr>
+          <w:spacing w:val="-17"/>
           <w:sz w:val="28"/>
         </w:rPr>
         <w:t xml:space="preserve"> </w:t>
@@ -673,21 +697,21 @@
           <w:spacing w:val="-2"/>
           <w:sz w:val="28"/>
         </w:rPr>
-        <w:t>Computer</w:t>
-      </w:r>
-      <w:r>
-        <w:rPr>
-          <w:spacing w:val="-17"/>
-          <w:sz w:val="28"/>
-        </w:rPr>
-        <w:t xml:space="preserve"> </w:t>
+        <w:t>Science</w:t>
       </w:r>
       <w:r>
         <w:rPr>
           <w:spacing w:val="-2"/>
           <w:sz w:val="28"/>
         </w:rPr>
-        <w:t xml:space="preserve">Science </w:t>
+        <w:t>,</w:t>
+      </w:r>
+      <w:r>
+        <w:rPr>
+          <w:spacing w:val="-2"/>
+          <w:sz w:val="28"/>
+        </w:rPr>
+        <w:t xml:space="preserve"> </w:t>
       </w:r>
       <w:r>
         <w:rPr>
@@ -708,7 +732,42 @@
           <w:w w:val="90"/>
           <w:sz w:val="28"/>
         </w:rPr>
-        <w:t>Mysuru-</w:t>
+        <w:t>Mys</w:t>
+      </w:r>
+      <w:r>
+        <w:rPr>
+          <w:w w:val="90"/>
+          <w:sz w:val="28"/>
+        </w:rPr>
+        <w:t>o</w:t>
+      </w:r>
+      <w:r>
+        <w:rPr>
+          <w:w w:val="90"/>
+          <w:sz w:val="28"/>
+        </w:rPr>
+        <w:t>r</w:t>
+      </w:r>
+      <w:r>
+        <w:rPr>
+          <w:w w:val="90"/>
+          <w:sz w:val="28"/>
+        </w:rPr>
+        <w:t>e</w:t>
+      </w:r>
+      <w:r>
+        <w:rPr>
+          <w:w w:val="90"/>
+          <w:sz w:val="28"/>
+        </w:rPr>
+        <w:t>-</w:t>
+      </w:r>
+      <w:r>
+        <w:rPr>
+          <w:w w:val="90"/>
+          <w:sz w:val="28"/>
+        </w:rPr>
+        <w:t>5700</w:t>
       </w:r>
       <w:r>
         <w:rPr>
@@ -1255,13 +1314,6 @@
       </w:r>
       <w:r>
         <w:rPr>
-          <w:szCs w:val="32"/>
-          <w:lang w:val="en-IN"/>
-        </w:rPr>
-        <w:tab/>
-      </w:r>
-      <w:r>
-        <w:rPr>
           <w:spacing w:val="-2"/>
         </w:rPr>
         <w:t>Head</w:t>
@@ -1385,15 +1437,6 @@
           <w:szCs w:val="32"/>
           <w:lang w:val="en-IN"/>
         </w:rPr>
-        <w:tab/>
-      </w:r>
-      <w:r>
-        <w:rPr>
-          <w:b/>
-          <w:bCs/>
-          <w:szCs w:val="32"/>
-          <w:lang w:val="en-IN"/>
-        </w:rPr>
         <w:t>Mrs. Suneetha</w:t>
       </w:r>
     </w:p>
@@ -1441,12 +1484,6 @@
           <w:szCs w:val="32"/>
         </w:rPr>
         <w:tab/>
-      </w:r>
-      <w:r>
-        <w:rPr>
-          <w:szCs w:val="32"/>
-        </w:rPr>
-        <w:tab/>
         <w:t>Chairperson</w:t>
       </w:r>
     </w:p>
@@ -1463,12 +1500,18 @@
         <w:rPr>
           <w:szCs w:val="32"/>
         </w:rPr>
-        <w:t xml:space="preserve">Department of Computer Science, </w:t>
+        <w:t>Department of Studies in Computer Science</w:t>
       </w:r>
       <w:r>
         <w:rPr>
           <w:szCs w:val="32"/>
         </w:rPr>
+        <w:t xml:space="preserve">, </w:t>
+      </w:r>
+      <w:r>
+        <w:rPr>
+          <w:szCs w:val="32"/>
+        </w:rPr>
         <w:tab/>
       </w:r>
       <w:r>
@@ -1481,26 +1524,13 @@
         <w:rPr>
           <w:szCs w:val="32"/>
         </w:rPr>
-        <w:tab/>
+        <w:t>Department of Studies in Computer Science</w:t>
       </w:r>
       <w:r>
         <w:rPr>
           <w:szCs w:val="32"/>
         </w:rPr>
-        <w:tab/>
-        <w:t>Department</w:t>
-      </w:r>
-      <w:r>
-        <w:rPr>
-          <w:szCs w:val="32"/>
-        </w:rPr>
-        <w:t xml:space="preserve"> </w:t>
-      </w:r>
-      <w:r>
-        <w:rPr>
-          <w:szCs w:val="32"/>
-        </w:rPr>
-        <w:t>of Computer Science,</w:t>
+        <w:t>,</w:t>
       </w:r>
     </w:p>
     <w:p>
@@ -1560,12 +1590,6 @@
         </w:rPr>
         <w:tab/>
       </w:r>
-      <w:r>
-        <w:rPr>
-          <w:szCs w:val="32"/>
-        </w:rPr>
-        <w:tab/>
-      </w:r>
       <w:proofErr w:type="spellStart"/>
       <w:r>
         <w:rPr>
@@ -1589,12 +1613,6 @@
           <w:szCs w:val="32"/>
         </w:rPr>
         <w:t>Mysuru-06</w:t>
-      </w:r>
-      <w:r>
-        <w:rPr>
-          <w:szCs w:val="32"/>
-        </w:rPr>
-        <w:tab/>
       </w:r>
       <w:r>
         <w:rPr>
@@ -5735,15 +5753,31 @@
         <w:jc w:val="both"/>
       </w:pPr>
       <w:r>
-        <w:t xml:space="preserve">The main scope of the project is to provide a website for the betterment of Farmers. Now farmers facing problems like they are not getting the expected price for their crops and </w:t>
+        <w:t xml:space="preserve">The main scope of the project is to provide a website for the betterment of Farmers. Now farmers </w:t>
       </w:r>
       <w:proofErr w:type="gramStart"/>
       <w:r>
+        <w:t>facing</w:t>
+      </w:r>
+      <w:proofErr w:type="gramEnd"/>
+      <w:r>
+        <w:t xml:space="preserve"> problems like they are not getting the expected price for their crops and </w:t>
+      </w:r>
+      <w:proofErr w:type="gramStart"/>
+      <w:r>
         <w:t>also</w:t>
       </w:r>
       <w:proofErr w:type="gramEnd"/>
       <w:r>
-        <w:t xml:space="preserve"> they are not able to purchase the necessary products because of the mediators.</w:t>
+        <w:t xml:space="preserve"> they </w:t>
+      </w:r>
+      <w:proofErr w:type="gramStart"/>
+      <w:r>
+        <w:t>are not able to</w:t>
+      </w:r>
+      <w:proofErr w:type="gramEnd"/>
+      <w:r>
+        <w:t xml:space="preserve"> purchase the necessary products because of the mediators.</w:t>
       </w:r>
     </w:p>
     <w:p>
@@ -7129,11 +7163,9 @@
       <w:r>
         <w:t xml:space="preserve">MySQL is the world’s most widely used opensource Relational Database Management System (RDBMS) that runs as a server providing multi-user access to a number of databases. The MySQL development project has made it source code available under the terms of the GNU General Public License, as well as under a variety of proprietary agreements. MySQL was owned and sponsored by a single </w:t>
       </w:r>
-      <w:proofErr w:type="gramStart"/>
       <w:r>
         <w:t>for profit</w:t>
       </w:r>
-      <w:proofErr w:type="gramEnd"/>
       <w:r>
         <w:t xml:space="preserve"> firm, the Swedish company MySQL AB, now owned by Oracle Corporation. MySQL is a popular choice of database for use in web applications, and is a central development of the widely used LAMP opensource web application software stack. LAMP is an acronym for “Linux, Apache, MySQL, </w:t>
       </w:r>
@@ -7375,7 +7407,7 @@
           <w:lang w:val="en-IN" w:eastAsia="en-IN"/>
         </w:rPr>
         <w:drawing>
-          <wp:anchor distT="0" distB="0" distL="114300" distR="114300" simplePos="0" relativeHeight="251668480" behindDoc="0" locked="0" layoutInCell="1" allowOverlap="1" wp14:anchorId="34FCB009" wp14:editId="0934FD87">
+          <wp:anchor distT="0" distB="0" distL="114300" distR="114300" simplePos="0" relativeHeight="251668480" behindDoc="0" locked="0" layoutInCell="1" allowOverlap="1" wp14:anchorId="34FCB009" wp14:editId="36BDE594">
             <wp:simplePos x="0" y="0"/>
             <wp:positionH relativeFrom="column">
               <wp:posOffset>899160</wp:posOffset>

</xml_diff>